<commit_message>
publish student projects (Fall 2026) 2026-09-22 18:52
</commit_message>
<xml_diff>
--- a/Games/graveyard-shift.docx
+++ b/Games/graveyard-shift.docx
@@ -2663,13 +2663,13 @@
         <w:rPr>
           <w:b/>
         </w:rPr>
-        <w:t xml:space="preserve">Recommended composition:</w:t>
-      </w:r>
-      <w:r>
-        <w:t xml:space="preserve"> </w:t>
-      </w:r>
-      <w:r>
-        <w:t xml:space="preserve">6 CS + 2 Design + 1 Art (9) — this is a</w:t>
+        <w:t xml:space="preserve">Team composition (set by instructor):</w:t>
+      </w:r>
+      <w:r>
+        <w:t xml:space="preserve"> </w:t>
+      </w:r>
+      <w:r>
+        <w:t xml:space="preserve">6 CS + 2 Design + 0 Art (8) — this is a</w:t>
       </w:r>
       <w:r>
         <w:t xml:space="preserve"> </w:t>
@@ -2684,7 +2684,34 @@
         <w:t xml:space="preserve"> </w:t>
       </w:r>
       <w:r>
-        <w:t xml:space="preserve">game, so the design surface is large (the seating/mood/agitation/riot rules, the ingredient economy, the day-cycle riot-risk curve, personality tuning, and the reworked monetization), fitting two designers (the proposal already names "UXGD teammates"); one artist can carry a stylised spooky-comedy roster (the ghost/zombie/ghoul factions + personality tells, the restaurant, dishes, projectiles/remains and riot VFX) (rules: min 1 Design mandated, max 9 total, D+A ≤ 3; see</w:t>
+        <w:t xml:space="preserve">game with a large design surface (the seating/mood/agitation/riot rules, the ingredient economy, the day-cycle riot-risk curve, personality tuning, and the reworked monetization), which the two designers own; with</w:t>
+      </w:r>
+      <w:r>
+        <w:t xml:space="preserve"> </w:t>
+      </w:r>
+      <w:r>
+        <w:rPr>
+          <w:b/>
+        </w:rPr>
+        <w:t xml:space="preserve">no artist</w:t>
+      </w:r>
+      <w:r>
+        <w:t xml:space="preserve">, the designers take the</w:t>
+      </w:r>
+      <w:r>
+        <w:t xml:space="preserve"> </w:t>
+      </w:r>
+      <w:r>
+        <w:rPr>
+          <w:b/>
+        </w:rPr>
+        <w:t xml:space="preserve">D11 conditional</w:t>
+      </w:r>
+      <w:r>
+        <w:t xml:space="preserve"> </w:t>
+      </w:r>
+      <w:r>
+        <w:t xml:space="preserve">as a real graded Design goal each milestone (M1 Art Proof of Concept / M2 Art Implementation Quality — the last Design goal each milestone), which consumes one Design+UI slot per milestone (rules: min 1 Design mandated, max 9 total, D+A ≤ 3; see</w:t>
       </w:r>
       <w:r>
         <w:t xml:space="preserve"> </w:t>
@@ -2696,7 +2723,22 @@
         <w:t xml:space="preserve">team-formation.pdf</w:t>
       </w:r>
       <w:r>
-        <w:t xml:space="preserve">). If the customer/faction art volume outgrows one artist, trade the 2nd designer for a 2nd artist.</w:t>
+        <w:t xml:space="preserve">).</w:t>
+      </w:r>
+      <w:r>
+        <w:t xml:space="preserve"> </w:t>
+      </w:r>
+      <w:r>
+        <w:rPr>
+          <w:b/>
+        </w:rPr>
+        <w:t xml:space="preserve">Art-risk flag:</w:t>
+      </w:r>
+      <w:r>
+        <w:t xml:space="preserve"> </w:t>
+      </w:r>
+      <w:r>
+        <w:t xml:space="preserve">a spooky-comedy game is art-forward (the ghost/zombie/ghoul roster + personality tells, the restaurant, dishes, projectiles/remains and riot VFX), so 0 artists is a real risk here — scope the roster small and lean on a strong stylised/reusable direction under D11, or reconsider adding an artist within the D+A ≤ 3 cap by trading a designer.</w:t>
       </w:r>
       <w:r>
         <w:t xml:space="preserve"> </w:t>
@@ -2809,6 +2851,18 @@
     <w:p>
       <w:pPr>
         <w:numPr>
+          <w:ilvl w:val="1"/>
+          <w:numId w:val="1018"/>
+        </w:numPr>
+        <w:pStyle w:val="Compact"/>
+      </w:pPr>
+      <w:r>
+        <w:t xml:space="preserve">M1D11 Art Proof of Concept *(conditional — no artist; Design-owned)* — the spooky-comedy visual direction: the ghost/zombie/ghoul faction identities + personality tells, and the restaurant, dishes/projectiles and riot-VFX look; 2 mockups.</w:t>
+      </w:r>
+    </w:p>
+    <w:p>
+      <w:pPr>
+        <w:numPr>
           <w:ilvl w:val="0"/>
           <w:numId w:val="1017"/>
         </w:numPr>
@@ -2884,6 +2938,18 @@
     <w:p>
       <w:pPr>
         <w:numPr>
+          <w:ilvl w:val="1"/>
+          <w:numId w:val="1019"/>
+        </w:numPr>
+        <w:pStyle w:val="Compact"/>
+      </w:pPr>
+      <w:r>
+        <w:t xml:space="preserve">M2D11 Art Implementation Quality *(conditional — no artist; Design-owned)* — the roster + personality tells, restaurant, dishes/projectiles and riot VFX implemented in-engine, no placeholders.</w:t>
+      </w:r>
+    </w:p>
+    <w:p>
+      <w:pPr>
+        <w:numPr>
           <w:ilvl w:val="0"/>
           <w:numId w:val="1017"/>
         </w:numPr>
@@ -2929,18 +2995,6 @@
     <w:p>
       <w:pPr>
         <w:numPr>
-          <w:ilvl w:val="1"/>
-          <w:numId w:val="1020"/>
-        </w:numPr>
-        <w:pStyle w:val="Compact"/>
-      </w:pPr>
-      <w:r>
-        <w:t xml:space="preserve">M1U3 Accessibility &amp; Readability Foundations — legible mood/agitation cues, contrast and touch targets on a phone.</w:t>
-      </w:r>
-    </w:p>
-    <w:p>
-      <w:pPr>
-        <w:numPr>
           <w:ilvl w:val="0"/>
           <w:numId w:val="1017"/>
         </w:numPr>
@@ -2992,18 +3046,6 @@
     <w:p>
       <w:pPr>
         <w:numPr>
-          <w:ilvl w:val="1"/>
-          <w:numId w:val="1021"/>
-        </w:numPr>
-        <w:pStyle w:val="Compact"/>
-      </w:pPr>
-      <w:r>
-        <w:t xml:space="preserve">M2U4 Onboarding &amp; Tutorial Design — teach seat-by-kind → riot → collect in the first day without a wall of text.</w:t>
-      </w:r>
-    </w:p>
-    <w:p>
-      <w:pPr>
-        <w:numPr>
           <w:ilvl w:val="0"/>
           <w:numId w:val="1017"/>
         </w:numPr>
@@ -3013,49 +3055,13 @@
         <w:rPr>
           <w:b/>
         </w:rPr>
-        <w:t xml:space="preserve">Art M1:</w:t>
-      </w:r>
-      <w:r>
-        <w:t xml:space="preserve"> </w:t>
-      </w:r>
-      <w:r>
-        <w:t xml:space="preserve">1 artist (stylised spooky-comedy roster + restaurant + VFX)</w:t>
-      </w:r>
-    </w:p>
-    <w:p>
-      <w:pPr>
-        <w:numPr>
-          <w:ilvl w:val="1"/>
-          <w:numId w:val="1022"/>
-        </w:numPr>
-        <w:pStyle w:val="Compact"/>
-      </w:pPr>
-      <w:r>
-        <w:t xml:space="preserve">M1A1 ⭐ Art Bible / Proof of Concept (the darkly-comic visual direction — palette, the ghost/zombie/ghoul faction language, readability of mood/riot)</w:t>
-      </w:r>
-    </w:p>
-    <w:p>
-      <w:pPr>
-        <w:numPr>
-          <w:ilvl w:val="1"/>
-          <w:numId w:val="1022"/>
-        </w:numPr>
-        <w:pStyle w:val="Compact"/>
-      </w:pPr>
-      <w:r>
-        <w:t xml:space="preserve">M1A2 Character Concepts &amp; Model Sheets (the 3 factions + personality tells + the player, with mood/riot expression sheets)</w:t>
-      </w:r>
-    </w:p>
-    <w:p>
-      <w:pPr>
-        <w:numPr>
-          <w:ilvl w:val="1"/>
-          <w:numId w:val="1022"/>
-        </w:numPr>
-        <w:pStyle w:val="Compact"/>
-      </w:pPr>
-      <w:r>
-        <w:t xml:space="preserve">M1A3 Environment, Props &amp; VFX Concepts (the graveyard restaurant, dishes, projectiles, remains/ingredients + riot VFX concepts)</w:t>
+        <w:t xml:space="preserve">Art:</w:t>
+      </w:r>
+      <w:r>
+        <w:t xml:space="preserve"> </w:t>
+      </w:r>
+      <w:r>
+        <w:t xml:space="preserve">0 artists — the art surface (the ghost/zombie/ghoul roster + personality tells, the restaurant, dishes/projectiles and riot VFX) is covered by the D11 conditionals, taken as Design goals by the two designers (see Design M1/M2). Given how art-forward the concept is, scope the roster small and lean on a reusable stylised direction.</w:t>
       </w:r>
     </w:p>
     <w:p>
@@ -3070,43 +3076,31 @@
         <w:rPr>
           <w:b/>
         </w:rPr>
-        <w:t xml:space="preserve">Art M2:</w:t>
-      </w:r>
-    </w:p>
-    <w:p>
-      <w:pPr>
-        <w:numPr>
-          <w:ilvl w:val="1"/>
-          <w:numId w:val="1023"/>
-        </w:numPr>
-        <w:pStyle w:val="Compact"/>
-      </w:pPr>
-      <w:r>
-        <w:t xml:space="preserve">M2A1 ⭐ Critical Asset Production &amp; In-Engine Visual Quality (customers, restaurant, dishes, projectiles + HUD implemented and consistent)</w:t>
-      </w:r>
-    </w:p>
-    <w:p>
-      <w:pPr>
-        <w:numPr>
-          <w:ilvl w:val="1"/>
-          <w:numId w:val="1023"/>
-        </w:numPr>
-        <w:pStyle w:val="Compact"/>
-      </w:pPr>
-      <w:r>
-        <w:t xml:space="preserve">M2A2 Character Animation — Extensive (idle/agitated/riot/throw cycles per faction, driven by the event-animation system)</w:t>
-      </w:r>
-    </w:p>
-    <w:p>
-      <w:pPr>
-        <w:numPr>
-          <w:ilvl w:val="1"/>
-          <w:numId w:val="1023"/>
-        </w:numPr>
-        <w:pStyle w:val="Compact"/>
-      </w:pPr>
-      <w:r>
-        <w:t xml:space="preserve">M2A5 VFX — Critical Effects &amp; Transitions (riot chaos, projectile impacts, remains/ingredient drops, day/night transitions)</w:t>
+        <w:t xml:space="preserve">TEAM M1:</w:t>
+      </w:r>
+    </w:p>
+    <w:p>
+      <w:pPr>
+        <w:numPr>
+          <w:ilvl w:val="1"/>
+          <w:numId w:val="1022"/>
+        </w:numPr>
+        <w:pStyle w:val="Compact"/>
+      </w:pPr>
+      <w:r>
+        <w:t xml:space="preserve">M1TA1 ⭐ Overall Audio Experience — initial BGM/SFX from the week-5 needs list present &amp; working in the prototype (spooky-comic BGM, seat, agitate, riot/throw, collect and day-change cues), suitable and correctly triggered (the throw-frame SFX fires from the animation event).</w:t>
+      </w:r>
+    </w:p>
+    <w:p>
+      <w:pPr>
+        <w:numPr>
+          <w:ilvl w:val="1"/>
+          <w:numId w:val="1022"/>
+        </w:numPr>
+        <w:pStyle w:val="Compact"/>
+      </w:pPr>
+      <w:r>
+        <w:t xml:space="preserve">M1TA2 ⭐ Audio Engine Functionality — data-driven audio pipeline (add/replace files without recompiling) + reliable multi-channel playback for a projectile-storm mix.</w:t>
       </w:r>
     </w:p>
     <w:p>
@@ -3121,45 +3115,6 @@
         <w:rPr>
           <w:b/>
         </w:rPr>
-        <w:t xml:space="preserve">TEAM M1:</w:t>
-      </w:r>
-    </w:p>
-    <w:p>
-      <w:pPr>
-        <w:numPr>
-          <w:ilvl w:val="1"/>
-          <w:numId w:val="1024"/>
-        </w:numPr>
-        <w:pStyle w:val="Compact"/>
-      </w:pPr>
-      <w:r>
-        <w:t xml:space="preserve">M1TA1 ⭐ Overall Audio Experience — initial BGM/SFX from the week-5 needs list present &amp; working in the prototype (spooky-comic BGM, seat, agitate, riot/throw, collect and day-change cues), suitable and correctly triggered (the throw-frame SFX fires from the animation event).</w:t>
-      </w:r>
-    </w:p>
-    <w:p>
-      <w:pPr>
-        <w:numPr>
-          <w:ilvl w:val="1"/>
-          <w:numId w:val="1024"/>
-        </w:numPr>
-        <w:pStyle w:val="Compact"/>
-      </w:pPr>
-      <w:r>
-        <w:t xml:space="preserve">M1TA2 ⭐ Audio Engine Functionality — data-driven audio pipeline (add/replace files without recompiling) + reliable multi-channel playback for a projectile-storm mix.</w:t>
-      </w:r>
-    </w:p>
-    <w:p>
-      <w:pPr>
-        <w:numPr>
-          <w:ilvl w:val="0"/>
-          <w:numId w:val="1017"/>
-        </w:numPr>
-        <w:pStyle w:val="Compact"/>
-      </w:pPr>
-      <w:r>
-        <w:rPr>
-          <w:b/>
-        </w:rPr>
         <w:t xml:space="preserve">TEAM M2:</w:t>
       </w:r>
     </w:p>
@@ -3167,7 +3122,7 @@
       <w:pPr>
         <w:numPr>
           <w:ilvl w:val="1"/>
-          <w:numId w:val="1025"/>
+          <w:numId w:val="1023"/>
         </w:numPr>
         <w:pStyle w:val="Compact"/>
       </w:pPr>
@@ -3179,7 +3134,7 @@
       <w:pPr>
         <w:numPr>
           <w:ilvl w:val="1"/>
-          <w:numId w:val="1025"/>
+          <w:numId w:val="1023"/>
         </w:numPr>
         <w:pStyle w:val="Compact"/>
       </w:pPr>
@@ -3191,7 +3146,7 @@
       <w:pPr>
         <w:numPr>
           <w:ilvl w:val="1"/>
-          <w:numId w:val="1025"/>
+          <w:numId w:val="1023"/>
         </w:numPr>
         <w:pStyle w:val="Compact"/>
       </w:pPr>
@@ -3536,12 +3491,6 @@
     <w:abstractNumId w:val="991"/>
   </w:num>
   <w:num w:numId="1023">
-    <w:abstractNumId w:val="991"/>
-  </w:num>
-  <w:num w:numId="1024">
-    <w:abstractNumId w:val="991"/>
-  </w:num>
-  <w:num w:numId="1025">
     <w:abstractNumId w:val="991"/>
   </w:num>
 </w:numbering>

</xml_diff>